<commit_message>
Konfigok és ip-cimzes doksi
</commit_message>
<xml_diff>
--- a/IP-cimzes.docx
+++ b/IP-cimzes.docx
@@ -4,19 +4,22 @@
   <w:body>
     <w:p>
       <w:pPr>
+        <w:jc w:val="center"/>
         <w:rPr>
           <w:b/>
           <w:bCs/>
-          <w:sz w:val="32"/>
-          <w:szCs w:val="32"/>
+          <w:sz w:val="48"/>
+          <w:szCs w:val="48"/>
+          <w:u w:val="single"/>
         </w:rPr>
       </w:pPr>
       <w:r>
         <w:rPr>
           <w:b/>
           <w:bCs/>
-          <w:sz w:val="32"/>
-          <w:szCs w:val="32"/>
+          <w:sz w:val="48"/>
+          <w:szCs w:val="48"/>
+          <w:u w:val="single"/>
         </w:rPr>
         <w:t>IP-címzési terv</w:t>
       </w:r>
@@ -32,10 +35,10 @@
         <w:tblLook w:val="04A0" w:firstRow="1" w:lastRow="0" w:firstColumn="1" w:lastColumn="0" w:noHBand="0" w:noVBand="1"/>
       </w:tblPr>
       <w:tblGrid>
-        <w:gridCol w:w="2847"/>
-        <w:gridCol w:w="1806"/>
-        <w:gridCol w:w="1952"/>
-        <w:gridCol w:w="2451"/>
+        <w:gridCol w:w="3094"/>
+        <w:gridCol w:w="1709"/>
+        <w:gridCol w:w="1877"/>
+        <w:gridCol w:w="2376"/>
       </w:tblGrid>
       <w:tr>
         <w:trPr>
@@ -206,13 +209,8 @@
             <w:hideMark/>
           </w:tcPr>
           <w:p>
-            <w:proofErr w:type="spellStart"/>
-            <w:r>
-              <w:t>RizserR</w:t>
-            </w:r>
-            <w:proofErr w:type="spellEnd"/>
-            <w:r>
-              <w:t xml:space="preserve"> HQ</w:t>
+            <w:r>
+              <w:t>Tatai Központ</w:t>
             </w:r>
           </w:p>
         </w:tc>
@@ -316,13 +314,8 @@
             <w:hideMark/>
           </w:tcPr>
           <w:p>
-            <w:proofErr w:type="spellStart"/>
-            <w:r>
-              <w:t>RizserR</w:t>
-            </w:r>
-            <w:proofErr w:type="spellEnd"/>
-            <w:r>
-              <w:t xml:space="preserve"> HQ</w:t>
+            <w:r>
+              <w:t>Tatai Központ</w:t>
             </w:r>
           </w:p>
         </w:tc>
@@ -442,13 +435,8 @@
             <w:hideMark/>
           </w:tcPr>
           <w:p>
-            <w:proofErr w:type="spellStart"/>
-            <w:r>
-              <w:t>RizserR</w:t>
-            </w:r>
-            <w:proofErr w:type="spellEnd"/>
-            <w:r>
-              <w:t xml:space="preserve"> HQ</w:t>
+            <w:r>
+              <w:t>Tatai Központ</w:t>
             </w:r>
           </w:p>
         </w:tc>
@@ -909,7 +897,21 @@
                 <w:b/>
                 <w:bCs/>
               </w:rPr>
-              <w:t>WAN 1 (HQ - AK Iroda)</w:t>
+              <w:t>WAN 1 (</w:t>
+            </w:r>
+            <w:r>
+              <w:rPr>
+                <w:b/>
+                <w:bCs/>
+              </w:rPr>
+              <w:t>Központ</w:t>
+            </w:r>
+            <w:r>
+              <w:rPr>
+                <w:b/>
+                <w:bCs/>
+              </w:rPr>
+              <w:t>- AK Iroda)</w:t>
             </w:r>
           </w:p>
         </w:tc>
@@ -1014,7 +1016,21 @@
                 <w:b/>
                 <w:bCs/>
               </w:rPr>
-              <w:t xml:space="preserve">WAN 2 (HQ - </w:t>
+              <w:t>WAN 2 (</w:t>
+            </w:r>
+            <w:r>
+              <w:rPr>
+                <w:b/>
+                <w:bCs/>
+              </w:rPr>
+              <w:t>Központ</w:t>
+            </w:r>
+            <w:r>
+              <w:rPr>
+                <w:b/>
+                <w:bCs/>
+              </w:rPr>
+              <w:t xml:space="preserve">- </w:t>
             </w:r>
             <w:proofErr w:type="spellStart"/>
             <w:r>

</xml_diff>